<commit_message>
no lab or TierPoint wording in the automation, guides or handouts; naming_token and platform_operators keys; presenter-only tooling not published; follow-along, handouts, PDF and DOCX regenerated
Co-Authored-By: Claude Sonnet 5.5 <noreply@anthropic.com>
</commit_message>
<xml_diff>
--- a/handouts/Platform_Comparison.docx
+++ b/handouts/Platform_Comparison.docx
@@ -80,7 +80,7 @@
           <w:szCs w:val="21"/>
           <w:lang w:val="en"/>
         </w:rPr>
-        <w:t>prepared 2026-10-06; cloud-only Azure Files guidance reviewed 2026-10-09 from Microsoft Learn (2609 release family for Azure Local) and the session lab; every cell was checked against the Learn pages listed under Sources. Support statements change by release, so re-check the linked documentation before you design from this table.</w:t>
+        <w:t>prepared 2026-10-06; cloud-only Azure Files guidance reviewed 2026-10-09 from Microsoft Learn (2609 release family for Azure Local) and the session demo environment; every cell was checked against the Learn pages listed under Sources. Support statements change by release, so re-check the linked documentation before you design from this table.</w:t>
       </w:r>
     </w:p>
     <w:tbl>
@@ -3445,7 +3445,7 @@
           <w:szCs w:val="21"/>
           <w:lang w:val="en"/>
         </w:rPr>
-        <w:t>Microsoft Learn: Azure Virtual Desktop on Azure Local (over</w:t>
+        <w:t>Microsoft Learn: Azure Virtual Desktop on Azur</w:t>
       </w:r>
       <w:r>
         <w:rPr>
@@ -3455,7 +3455,7 @@
           <w:szCs w:val="21"/>
           <w:lang w:val="en"/>
         </w:rPr>
-        <w:t>view, supported configurations, limitations, licensing and pricing); Azure Virtual Desktop for Azure Local (architecture); Azure Virtual Desktop Hybrid overview and deployment; Licensing Azure Virtual Desktop; Prepare GPUs for Azure Local, Manage GPUs via Discrete Device Assignment, Manage GPUs using partitioning; Autoscale scaling plans, glossary and scenarios; Deploy Azure Virtual Desktop (session host configuration); Enable Microsoft Entra Kerberos authentication for hybrid and cloud-only identities on A</w:t>
+        <w:t>e Local (overview, supported configurations, limitations, licensing and pricing); Azure Virtual Desktop for Azure Local (architecture); Azure Virtual Desktop Hybrid overview and deployment; Licensing Azure Virtual Desktop; Prepare GPUs for Azure Local, Manage GPUs via Discrete Device Assignment, Manage GPUs using partitioning; Autoscale scaling plans, glossary and scenarios; Deploy Azure Virtual Desktop (session host configuration); Enable Microsoft Entra Kerberos authentication for hybrid and cloud-only id</w:t>
       </w:r>
       <w:r>
         <w:rPr>
@@ -3465,7 +3465,7 @@
           <w:szCs w:val="21"/>
           <w:lang w:val="en"/>
         </w:rPr>
-        <w:t>zure Files; Azure Update Manager FAQ.</w:t>
+        <w:t>entities on Azure Files; Azure Update Manager FAQ.</w:t>
       </w:r>
     </w:p>
     <w:p>
@@ -3569,9 +3569,9 @@
 <file path=word/numbering.xml><?xml version="1.0" encoding="utf-8"?>
 <w:numbering xmlns:wpc="http://schemas.microsoft.com/office/word/2010/wordprocessingCanvas" xmlns:cx="http://schemas.microsoft.com/office/drawing/2014/chartex" xmlns:cx1="http://schemas.microsoft.com/office/drawing/2015/9/8/chartex" xmlns:cx2="http://schemas.microsoft.com/office/drawing/2015/10/21/chartex" xmlns:cx3="http://schemas.microsoft.com/office/drawing/2016/5/9/chartex" xmlns:cx4="http://schemas.microsoft.com/office/drawing/2016/5/10/chartex" xmlns:cx5="http://schemas.microsoft.com/office/drawing/2016/5/11/chartex" xmlns:cx6="http://schemas.microsoft.com/office/drawing/2016/5/12/chartex" xmlns:cx7="http://schemas.microsoft.com/office/drawing/2016/5/13/chartex" xmlns:cx8="http://schemas.microsoft.com/office/drawing/2016/5/14/chartex" xmlns:mc="http://schemas.openxmlformats.org/markup-compatibility/2006" xmlns:aink="http://schemas.microsoft.com/office/drawing/2016/ink" xmlns:am3d="http://schemas.microsoft.com/office/drawing/2017/model3d" xmlns:o="urn:schemas-microsoft-com:office:office" xmlns:oel="http://schemas.microsoft.com/office/2019/extlst" xmlns:r="http://schemas.openxmlformats.org/officeDocument/2006/relationships" xmlns:m="http://schemas.openxmlformats.org/officeDocument/2006/math" xmlns:v="urn:schemas-microsoft-com:vml" xmlns:wp14="http://schemas.microsoft.com/office/word/2010/wordprocessingDrawing" xmlns:wp="http://schemas.openxmlformats.org/drawingml/2006/wordprocessingDrawing" xmlns:w10="urn:schemas-microsoft-com:office:word" xmlns:w="http://schemas.openxmlformats.org/wordprocessingml/2006/main" xmlns:w14="http://schemas.microsoft.com/office/word/2010/wordml" xmlns:w15="http://schemas.microsoft.com/office/word/2012/wordml" xmlns:w16cex="http://schemas.microsoft.com/office/word/2018/wordml/cex" xmlns:w16cid="http://schemas.microsoft.com/office/word/2016/wordml/cid" xmlns:w16="http://schemas.microsoft.com/office/word/2018/wordml" xmlns:w16du="http://schemas.microsoft.com/office/word/2023/wordml/word16du" xmlns:w16sdtdh="http://schemas.microsoft.com/office/word/2020/wordml/sdtdatahash" xmlns:w16sdtfl="http://schemas.microsoft.com/office/word/2024/wordml/sdtformatlock" xmlns:w16se="http://schemas.microsoft.com/office/word/2015/wordml/symex" xmlns:wpg="http://schemas.microsoft.com/office/word/2010/wordprocessingGroup" xmlns:wpi="http://schemas.microsoft.com/office/word/2010/wordprocessingInk" xmlns:wne="http://schemas.microsoft.com/office/word/2006/wordml" xmlns:wps="http://schemas.microsoft.com/office/word/2010/wordprocessingShape" mc:Ignorable="w14 w15 w16se w16cid w16 w16cex w16sdtdh w16sdtfl w16du wp14">
   <w:abstractNum w:abstractNumId="0" w15:restartNumberingAfterBreak="0">
-    <w:nsid w:val="3C471E3A"/>
+    <w:nsid w:val="7D8818F0"/>
     <w:multiLevelType w:val="multilevel"/>
-    <w:tmpl w:val="A18E6B70"/>
+    <w:tmpl w:val="4DFE6FEC"/>
     <w:lvl w:ilvl="0">
       <w:start w:val="1"/>
       <w:numFmt w:val="bullet"/>
@@ -3717,7 +3717,7 @@
       </w:rPr>
     </w:lvl>
   </w:abstractNum>
-  <w:num w:numId="1" w16cid:durableId="495070154">
+  <w:num w:numId="1" w16cid:durableId="260450314">
     <w:abstractNumId w:val="0"/>
   </w:num>
 </w:numbering>

</xml_diff>